<commit_message>
new resume file (#10)
</commit_message>
<xml_diff>
--- a/doc/RobertG_Resume.docx
+++ b/doc/RobertG_Resume.docx
@@ -59,7 +59,19 @@
           <w:sz w:val="22"/>
           <w:szCs w:val="22"/>
         </w:rPr>
-        <w:t xml:space="preserve">LYNN, MA </w:t>
+        <w:t>Boston</w:t>
+      </w:r>
+      <w:r>
+        <w:rPr>
+          <w:rFonts w:ascii="Calibri" w:hAnsi="Calibri" w:cs="Calibri"/>
+          <w:b w:val="0"/>
+          <w:bCs/>
+          <w:smallCaps/>
+          <w:spacing w:val="24"/>
+          <w:sz w:val="22"/>
+          <w:szCs w:val="22"/>
+        </w:rPr>
+        <w:t xml:space="preserve">, MA </w:t>
       </w:r>
     </w:p>
     <w:p>
@@ -101,7 +113,7 @@
             <w:sz w:val="22"/>
             <w:szCs w:val="22"/>
           </w:rPr>
-          <w:t xml:space="preserve">(781) 426-1370 </w:t>
+          <w:t>(781) 426-XXXX</w:t>
         </w:r>
       </w:hyperlink>
       <w:r>
@@ -114,7 +126,7 @@
           <w:sz w:val="22"/>
           <w:szCs w:val="22"/>
         </w:rPr>
-        <w:t xml:space="preserve"> | </w:t>
+        <w:t xml:space="preserve">| </w:t>
       </w:r>
       <w:r>
         <w:rPr>
@@ -262,6 +274,17 @@
           <w:shd w:val="clear" w:color="auto" w:fill="FFFFFF"/>
         </w:rPr>
         <w:t xml:space="preserve">Software Engineer skilled in automation (CI/CD), Security Architecture, and Incident Response. Embraces cross-collaboration to understand company workflows and architecture, enhancing knowledge and functionality. Experienced with SAST and security architecture. </w:t>
+      </w:r>
+      <w:r>
+        <w:rPr>
+          <w:rFonts w:cstheme="minorHAnsi"/>
+          <w:i/>
+          <w:iCs/>
+          <w:sz w:val="21"/>
+          <w:szCs w:val="21"/>
+          <w:shd w:val="clear" w:color="auto" w:fill="FFFFFF"/>
+        </w:rPr>
+        <w:t>Bringing energy, and unyielding grit.</w:t>
       </w:r>
     </w:p>
     <w:p>
@@ -355,7 +378,30 @@
                 <w:rFonts w:cstheme="minorHAnsi"/>
                 <w:color w:val="000000"/>
               </w:rPr>
-              <w:t>Python, Bash, C++, Java, Lisp, html</w:t>
+              <w:t>Python, Bash, C++, Java</w:t>
+            </w:r>
+            <w:r>
+              <w:rPr>
+                <w:rFonts w:cstheme="minorHAnsi"/>
+                <w:color w:val="000000"/>
+              </w:rPr>
+              <w:t xml:space="preserve">, </w:t>
+            </w:r>
+            <w:proofErr w:type="spellStart"/>
+            <w:r>
+              <w:rPr>
+                <w:rFonts w:cstheme="minorHAnsi"/>
+                <w:color w:val="000000"/>
+              </w:rPr>
+              <w:t>Elisp</w:t>
+            </w:r>
+            <w:proofErr w:type="spellEnd"/>
+            <w:r>
+              <w:rPr>
+                <w:rFonts w:cstheme="minorHAnsi"/>
+                <w:color w:val="000000"/>
+              </w:rPr>
+              <w:t>, html</w:t>
             </w:r>
           </w:p>
         </w:tc>
@@ -434,7 +480,31 @@
                 <w:rFonts w:cstheme="minorHAnsi"/>
                 <w:color w:val="000000"/>
               </w:rPr>
-              <w:t>AWS, Docker, GIT, SQL</w:t>
+              <w:t xml:space="preserve">AWS, </w:t>
+            </w:r>
+            <w:proofErr w:type="spellStart"/>
+            <w:r>
+              <w:rPr>
+                <w:rFonts w:ascii="Arial" w:hAnsi="Arial" w:cs="Arial"/>
+                <w:color w:val="262626"/>
+                <w:shd w:val="clear" w:color="auto" w:fill="FFFFFF"/>
+              </w:rPr>
+              <w:t>CMake</w:t>
+            </w:r>
+            <w:proofErr w:type="spellEnd"/>
+            <w:r>
+              <w:rPr>
+                <w:rFonts w:cstheme="minorHAnsi"/>
+                <w:color w:val="000000"/>
+              </w:rPr>
+              <w:t xml:space="preserve">, </w:t>
+            </w:r>
+            <w:r>
+              <w:rPr>
+                <w:rFonts w:cstheme="minorHAnsi"/>
+                <w:color w:val="000000"/>
+              </w:rPr>
+              <w:t>Docker, GIT, SQL</w:t>
             </w:r>
             <w:r>
               <w:rPr>
@@ -456,6 +526,13 @@
                 <w:color w:val="000000"/>
               </w:rPr>
               <w:t>logic</w:t>
+            </w:r>
+            <w:r>
+              <w:rPr>
+                <w:rFonts w:cstheme="minorHAnsi"/>
+                <w:color w:val="000000"/>
+              </w:rPr>
+              <w:t>, IDA</w:t>
             </w:r>
           </w:p>
         </w:tc>
@@ -589,6 +666,13 @@
           <w:rFonts w:ascii="Calibri" w:hAnsi="Calibri" w:cs="Calibri"/>
           <w:b/>
         </w:rPr>
+        <w:t xml:space="preserve"> </w:t>
+      </w:r>
+      <w:r>
+        <w:rPr>
+          <w:rFonts w:ascii="Calibri" w:hAnsi="Calibri" w:cs="Calibri"/>
+          <w:b/>
+        </w:rPr>
         <w:t>Software</w:t>
       </w:r>
       <w:r>
@@ -661,7 +745,19 @@
         <w:rPr>
           <w:rFonts w:ascii="Calibri" w:hAnsi="Calibri" w:cs="Calibri"/>
         </w:rPr>
-        <w:t xml:space="preserve">Led the design, planning, and strategic implementation of new features, dividing tasks into manageable components to enhance project management and streamline development. </w:t>
+        <w:t>Led the design, planning, and strategic implementation of new features, dividing tasks into manageable components to enhance project management and streamline development</w:t>
+      </w:r>
+      <w:r>
+        <w:rPr>
+          <w:rFonts w:ascii="Calibri" w:hAnsi="Calibri" w:cs="Calibri"/>
+        </w:rPr>
+        <w:t xml:space="preserve"> with JIRA</w:t>
+      </w:r>
+      <w:r>
+        <w:rPr>
+          <w:rFonts w:ascii="Calibri" w:hAnsi="Calibri" w:cs="Calibri"/>
+        </w:rPr>
+        <w:t xml:space="preserve">. </w:t>
       </w:r>
     </w:p>
     <w:p>
@@ -695,12 +791,14 @@
         </w:rPr>
         <w:t xml:space="preserve"> </w:t>
       </w:r>
-      <w:r>
-        <w:rPr>
-          <w:rFonts w:ascii="Calibri" w:hAnsi="Calibri" w:cs="Calibri"/>
-        </w:rPr>
-        <w:t>GitLab</w:t>
-      </w:r>
+      <w:proofErr w:type="spellStart"/>
+      <w:r>
+        <w:rPr>
+          <w:rFonts w:ascii="Calibri" w:hAnsi="Calibri" w:cs="Calibri"/>
+        </w:rPr>
+        <w:t>github</w:t>
+      </w:r>
+      <w:proofErr w:type="spellEnd"/>
       <w:r>
         <w:rPr>
           <w:rFonts w:ascii="Calibri" w:hAnsi="Calibri" w:cs="Calibri"/>
@@ -730,38 +828,6 @@
           <w:rFonts w:ascii="Calibri" w:hAnsi="Calibri" w:cs="Calibri"/>
         </w:rPr>
         <w:t xml:space="preserve"> the process, reduced the time over 90%. </w:t>
-      </w:r>
-    </w:p>
-    <w:p>
-      <w:pPr>
-        <w:pStyle w:val="ListParagraph"/>
-        <w:numPr>
-          <w:ilvl w:val="0"/>
-          <w:numId w:val="1"/>
-        </w:numPr>
-        <w:ind w:left="540"/>
-        <w:contextualSpacing w:val="0"/>
-        <w:rPr>
-          <w:rFonts w:ascii="Calibri" w:hAnsi="Calibri" w:cs="Calibri"/>
-        </w:rPr>
-      </w:pPr>
-      <w:r>
-        <w:rPr>
-          <w:rFonts w:ascii="Calibri" w:hAnsi="Calibri" w:cs="Calibri"/>
-        </w:rPr>
-        <w:t xml:space="preserve">Maintained local databases, kept third-party repositories such as Maven, </w:t>
-      </w:r>
-      <w:r>
-        <w:rPr>
-          <w:rFonts w:ascii="Calibri" w:hAnsi="Calibri" w:cs="Calibri"/>
-        </w:rPr>
-        <w:t>NuGet</w:t>
-      </w:r>
-      <w:r>
-        <w:rPr>
-          <w:rFonts w:ascii="Calibri" w:hAnsi="Calibri" w:cs="Calibri"/>
-        </w:rPr>
-        <w:t xml:space="preserve">, and Packagist in sync to further use in internal analysis. </w:t>
       </w:r>
     </w:p>
     <w:p>
@@ -784,220 +850,13 @@
         <w:rPr>
           <w:rFonts w:ascii="Calibri" w:hAnsi="Calibri" w:cs="Calibri"/>
         </w:rPr>
-        <w:t>Automated recompiling code</w:t>
-      </w:r>
-      <w:r>
-        <w:rPr>
-          <w:rFonts w:ascii="Calibri" w:hAnsi="Calibri" w:cs="Calibri"/>
-        </w:rPr>
-        <w:t xml:space="preserve"> utilizing python </w:t>
-      </w:r>
-      <w:r>
-        <w:rPr>
-          <w:rFonts w:ascii="Calibri" w:hAnsi="Calibri" w:cs="Calibri"/>
-        </w:rPr>
-        <w:t>and API to</w:t>
-      </w:r>
-      <w:r>
-        <w:rPr>
-          <w:rFonts w:ascii="Calibri" w:hAnsi="Calibri" w:cs="Calibri"/>
-        </w:rPr>
-        <w:t xml:space="preserve"> </w:t>
-      </w:r>
-      <w:r>
-        <w:rPr>
-          <w:rFonts w:ascii="Calibri" w:hAnsi="Calibri" w:cs="Calibri"/>
-        </w:rPr>
-        <w:t>develop a system to</w:t>
-      </w:r>
-      <w:r>
-        <w:rPr>
-          <w:rFonts w:ascii="Calibri" w:hAnsi="Calibri" w:cs="Calibri"/>
-        </w:rPr>
-        <w:t xml:space="preserve"> use latest version of a compiler with docker containers, increasing our resources used in internal testing. </w:t>
-      </w:r>
-    </w:p>
-    <w:p>
-      <w:pPr>
-        <w:pStyle w:val="ListParagraph"/>
-        <w:tabs>
-          <w:tab w:val="right" w:pos="10170"/>
-        </w:tabs>
-        <w:ind w:left="540"/>
-        <w:contextualSpacing w:val="0"/>
-        <w:rPr>
-          <w:rFonts w:ascii="Calibri" w:hAnsi="Calibri" w:cs="Calibri"/>
-        </w:rPr>
-      </w:pPr>
-      <w:r>
-        <w:rPr>
-          <w:rFonts w:ascii="Calibri" w:hAnsi="Calibri" w:cs="Calibri"/>
-        </w:rPr>
-        <w:tab/>
-      </w:r>
-      <w:r>
-        <w:rPr>
-          <w:rFonts w:ascii="Calibri" w:hAnsi="Calibri" w:cs="Calibri"/>
-        </w:rPr>
-        <w:t xml:space="preserve"> </w:t>
-      </w:r>
-    </w:p>
-    <w:p>
-      <w:pPr>
-        <w:tabs>
-          <w:tab w:val="right" w:pos="10170"/>
-        </w:tabs>
-        <w:rPr>
-          <w:rFonts w:ascii="Calibri" w:hAnsi="Calibri" w:cs="Calibri"/>
-        </w:rPr>
-      </w:pPr>
-      <w:r>
-        <w:rPr>
-          <w:rFonts w:ascii="Calibri" w:hAnsi="Calibri" w:cs="Calibri"/>
-          <w:b/>
-        </w:rPr>
-        <w:t>DevOps</w:t>
-      </w:r>
-      <w:r>
-        <w:rPr>
-          <w:rFonts w:ascii="Calibri" w:hAnsi="Calibri" w:cs="Calibri"/>
-          <w:b/>
-        </w:rPr>
-        <w:t xml:space="preserve"> Team Lea</w:t>
-      </w:r>
-      <w:r>
-        <w:rPr>
-          <w:rFonts w:ascii="Calibri" w:hAnsi="Calibri" w:cs="Calibri"/>
-          <w:b/>
-        </w:rPr>
-        <w:t>der</w:t>
-      </w:r>
-      <w:r>
-        <w:rPr>
-          <w:rFonts w:ascii="Calibri" w:hAnsi="Calibri" w:cs="Calibri"/>
-        </w:rPr>
-        <w:tab/>
-        <w:t>Sep 2018</w:t>
-      </w:r>
-      <w:r>
-        <w:rPr>
-          <w:rFonts w:ascii="Calibri" w:hAnsi="Calibri" w:cs="Calibri"/>
-        </w:rPr>
-        <w:t xml:space="preserve"> – </w:t>
-      </w:r>
-      <w:r>
-        <w:rPr>
-          <w:rFonts w:ascii="Calibri" w:hAnsi="Calibri" w:cs="Calibri"/>
-        </w:rPr>
-        <w:t>Oct 2020</w:t>
-      </w:r>
-    </w:p>
-    <w:p>
-      <w:pPr>
-        <w:pStyle w:val="ListParagraph"/>
-        <w:numPr>
-          <w:ilvl w:val="0"/>
-          <w:numId w:val="1"/>
-        </w:numPr>
-        <w:ind w:left="540"/>
-        <w:contextualSpacing w:val="0"/>
-        <w:rPr>
-          <w:rFonts w:ascii="Calibri" w:hAnsi="Calibri" w:cs="Calibri"/>
-        </w:rPr>
-      </w:pPr>
-      <w:r>
-        <w:rPr>
-          <w:rFonts w:ascii="Calibri" w:hAnsi="Calibri" w:cs="Calibri"/>
-        </w:rPr>
-        <w:t>Oversaw a team four engineers, achieving a 30% increase in project completion rates and a 20% improvement in ticket quality through effective leadership and strategic planning</w:t>
-      </w:r>
-      <w:r>
-        <w:rPr>
-          <w:rFonts w:ascii="Calibri" w:hAnsi="Calibri" w:cs="Calibri"/>
-        </w:rPr>
-        <w:t xml:space="preserve">. </w:t>
-      </w:r>
-    </w:p>
-    <w:p>
-      <w:pPr>
-        <w:pStyle w:val="ListParagraph"/>
-        <w:numPr>
-          <w:ilvl w:val="0"/>
-          <w:numId w:val="1"/>
-        </w:numPr>
-        <w:ind w:left="540"/>
-        <w:contextualSpacing w:val="0"/>
-        <w:rPr>
-          <w:rFonts w:ascii="Calibri" w:hAnsi="Calibri" w:cs="Calibri"/>
-        </w:rPr>
-      </w:pPr>
-      <w:r>
-        <w:rPr>
-          <w:rFonts w:ascii="Calibri" w:hAnsi="Calibri" w:cs="Calibri"/>
-        </w:rPr>
-        <w:t>Mentored junior engineers in the team, helping them to master technical concepts and gain proficiency with our toolkit, resulting in av</w:t>
-      </w:r>
-      <w:r>
-        <w:rPr>
-          <w:rFonts w:ascii="Calibri" w:hAnsi="Calibri" w:cs="Calibri"/>
-        </w:rPr>
-        <w:t xml:space="preserve">erage 40% improvement in their work quality. </w:t>
-      </w:r>
-    </w:p>
-    <w:p>
-      <w:pPr>
-        <w:pStyle w:val="ListParagraph"/>
-        <w:numPr>
-          <w:ilvl w:val="0"/>
-          <w:numId w:val="1"/>
-        </w:numPr>
-        <w:ind w:left="540"/>
-        <w:contextualSpacing w:val="0"/>
-        <w:rPr>
-          <w:rFonts w:ascii="Calibri" w:hAnsi="Calibri" w:cs="Calibri"/>
-        </w:rPr>
-      </w:pPr>
-      <w:r>
-        <w:rPr>
-          <w:rFonts w:ascii="Calibri" w:hAnsi="Calibri" w:cs="Calibri"/>
-        </w:rPr>
-        <w:t xml:space="preserve">Identified potential issues </w:t>
-      </w:r>
-      <w:r>
-        <w:rPr>
-          <w:rFonts w:ascii="Calibri" w:hAnsi="Calibri" w:cs="Calibri"/>
-        </w:rPr>
-        <w:t>in our microservices</w:t>
-      </w:r>
-      <w:r>
-        <w:rPr>
-          <w:rFonts w:ascii="Calibri" w:hAnsi="Calibri" w:cs="Calibri"/>
-        </w:rPr>
-        <w:t xml:space="preserve"> and raised concerns to optimize project </w:t>
-      </w:r>
-      <w:r>
-        <w:rPr>
-          <w:rFonts w:ascii="Calibri" w:hAnsi="Calibri" w:cs="Calibri"/>
-        </w:rPr>
-        <w:t>timelines</w:t>
-      </w:r>
-      <w:r>
-        <w:rPr>
-          <w:rFonts w:ascii="Calibri" w:hAnsi="Calibri" w:cs="Calibri"/>
-        </w:rPr>
-        <w:t xml:space="preserve"> and resource allocation, ultimately improving both quality of work and spe</w:t>
-      </w:r>
-      <w:r>
-        <w:rPr>
-          <w:rFonts w:ascii="Calibri" w:hAnsi="Calibri" w:cs="Calibri"/>
-        </w:rPr>
-        <w:t>e</w:t>
-      </w:r>
-      <w:r>
-        <w:rPr>
-          <w:rFonts w:ascii="Calibri" w:hAnsi="Calibri" w:cs="Calibri"/>
-        </w:rPr>
-        <w:t xml:space="preserve">d of customer responses by 25%. </w:t>
+        <w:t>Led root cause analysis using domain knowledge for production issues across AWS and cloud technologies, enhancing scalability and delivering rapid resolutions</w:t>
+      </w:r>
+      <w:r>
+        <w:rPr>
+          <w:rFonts w:ascii="Calibri" w:hAnsi="Calibri" w:cs="Calibri"/>
+        </w:rPr>
+        <w:t>.</w:t>
       </w:r>
     </w:p>
     <w:p>
@@ -1020,43 +879,31 @@
         <w:rPr>
           <w:rFonts w:ascii="Calibri" w:hAnsi="Calibri" w:cs="Calibri"/>
         </w:rPr>
-        <w:t>Assisted in migrating our on-premise datacenter to AWS cloud services</w:t>
-      </w:r>
-      <w:r>
-        <w:rPr>
-          <w:rFonts w:ascii="Calibri" w:hAnsi="Calibri" w:cs="Calibri"/>
-        </w:rPr>
-        <w:t xml:space="preserve"> and </w:t>
-      </w:r>
-      <w:r>
-        <w:rPr>
-          <w:rFonts w:ascii="Calibri" w:hAnsi="Calibri" w:cs="Calibri"/>
-        </w:rPr>
-        <w:t>collaborating</w:t>
-      </w:r>
-      <w:r>
-        <w:rPr>
-          <w:rFonts w:ascii="Calibri" w:hAnsi="Calibri" w:cs="Calibri"/>
-        </w:rPr>
-        <w:t xml:space="preserve"> with other teams</w:t>
-      </w:r>
-      <w:r>
-        <w:rPr>
-          <w:rFonts w:ascii="Calibri" w:hAnsi="Calibri" w:cs="Calibri"/>
-        </w:rPr>
-        <w:t xml:space="preserve">, driving a 40% reduction in operational costs and </w:t>
-      </w:r>
-      <w:r>
-        <w:rPr>
-          <w:rFonts w:ascii="Calibri" w:hAnsi="Calibri" w:cs="Calibri"/>
-        </w:rPr>
-        <w:t>enhancing</w:t>
-      </w:r>
-      <w:r>
-        <w:rPr>
-          <w:rFonts w:ascii="Calibri" w:hAnsi="Calibri" w:cs="Calibri"/>
-        </w:rPr>
-        <w:t xml:space="preserve"> system scalability and reliability. </w:t>
+        <w:t xml:space="preserve">Automated compiler compatibility testing for security scanning engine using Python, handling code deprecation across </w:t>
+      </w:r>
+      <w:r>
+        <w:rPr>
+          <w:rFonts w:ascii="Calibri" w:hAnsi="Calibri" w:cs="Calibri"/>
+        </w:rPr>
+        <w:t>multiple programming</w:t>
+      </w:r>
+      <w:r>
+        <w:rPr>
+          <w:rFonts w:ascii="Calibri" w:hAnsi="Calibri" w:cs="Calibri"/>
+        </w:rPr>
+        <w:t xml:space="preserve"> languages such as </w:t>
+      </w:r>
+      <w:r>
+        <w:rPr>
+          <w:rFonts w:ascii="Calibri" w:hAnsi="Calibri" w:cs="Calibri"/>
+        </w:rPr>
+        <w:t>Java/C++/.NET</w:t>
+      </w:r>
+      <w:r>
+        <w:rPr>
+          <w:rFonts w:ascii="Calibri" w:hAnsi="Calibri" w:cs="Calibri"/>
+        </w:rPr>
+        <w:t>.</w:t>
       </w:r>
     </w:p>
     <w:p>
@@ -1071,44 +918,55 @@
           <w:rFonts w:ascii="Calibri" w:hAnsi="Calibri" w:cs="Calibri"/>
         </w:rPr>
       </w:pPr>
+      <w:r>
+        <w:rPr>
+          <w:rFonts w:ascii="Calibri" w:hAnsi="Calibri" w:cs="Calibri"/>
+        </w:rPr>
+        <w:tab/>
+      </w:r>
+      <w:r>
+        <w:rPr>
+          <w:rFonts w:ascii="Calibri" w:hAnsi="Calibri" w:cs="Calibri"/>
+        </w:rPr>
+        <w:t xml:space="preserve"> </w:t>
+      </w:r>
     </w:p>
     <w:p>
       <w:pPr>
         <w:tabs>
-          <w:tab w:val="right" w:pos="10224"/>
+          <w:tab w:val="right" w:pos="10170"/>
         </w:tabs>
-        <w:spacing w:before="120" w:after="60"/>
+        <w:rPr>
+          <w:rFonts w:ascii="Calibri" w:hAnsi="Calibri" w:cs="Calibri"/>
+        </w:rPr>
+      </w:pPr>
+      <w:r>
         <w:rPr>
           <w:rFonts w:ascii="Calibri" w:hAnsi="Calibri" w:cs="Calibri"/>
           <w:b/>
         </w:rPr>
-      </w:pPr>
+        <w:t>DevOps</w:t>
+      </w:r>
       <w:r>
         <w:rPr>
           <w:rFonts w:ascii="Calibri" w:hAnsi="Calibri" w:cs="Calibri"/>
           <w:b/>
         </w:rPr>
-        <w:t>DevOps</w:t>
+        <w:t xml:space="preserve"> Team Lea</w:t>
       </w:r>
       <w:r>
         <w:rPr>
           <w:rFonts w:ascii="Calibri" w:hAnsi="Calibri" w:cs="Calibri"/>
           <w:b/>
         </w:rPr>
-        <w:t xml:space="preserve"> Engineer</w:t>
-      </w:r>
-      <w:r>
-        <w:rPr>
-          <w:rFonts w:ascii="Calibri" w:hAnsi="Calibri" w:cs="Calibri"/>
-          <w:b/>
+        <w:t>der</w:t>
+      </w:r>
+      <w:r>
+        <w:rPr>
+          <w:rFonts w:ascii="Calibri" w:hAnsi="Calibri" w:cs="Calibri"/>
         </w:rPr>
         <w:tab/>
-      </w:r>
-      <w:r>
-        <w:rPr>
-          <w:rFonts w:ascii="Calibri" w:hAnsi="Calibri" w:cs="Calibri"/>
-        </w:rPr>
-        <w:t>May 2016</w:t>
+        <w:t>Sep 2018</w:t>
       </w:r>
       <w:r>
         <w:rPr>
@@ -1120,7 +978,7 @@
         <w:rPr>
           <w:rFonts w:ascii="Calibri" w:hAnsi="Calibri" w:cs="Calibri"/>
         </w:rPr>
-        <w:t>Sep 2018</w:t>
+        <w:t>Oct 2020</w:t>
       </w:r>
     </w:p>
     <w:p>
@@ -1140,37 +998,13 @@
         <w:rPr>
           <w:rFonts w:ascii="Calibri" w:hAnsi="Calibri" w:cs="Calibri"/>
         </w:rPr>
-        <w:t xml:space="preserve">Provided guidance on effective </w:t>
-      </w:r>
-      <w:r>
-        <w:rPr>
-          <w:rFonts w:ascii="Calibri" w:hAnsi="Calibri" w:cs="Calibri"/>
-        </w:rPr>
-        <w:t>mitigation</w:t>
-      </w:r>
-      <w:r>
-        <w:rPr>
-          <w:rFonts w:ascii="Calibri" w:hAnsi="Calibri" w:cs="Calibri"/>
-        </w:rPr>
-        <w:t xml:space="preserve"> </w:t>
-      </w:r>
-      <w:r>
-        <w:rPr>
-          <w:rFonts w:ascii="Calibri" w:hAnsi="Calibri" w:cs="Calibri"/>
-        </w:rPr>
-        <w:t xml:space="preserve">strategies for </w:t>
-      </w:r>
-      <w:r>
-        <w:rPr>
-          <w:rFonts w:ascii="Calibri" w:hAnsi="Calibri" w:cs="Calibri"/>
-        </w:rPr>
-        <w:t>common CWEs and implementing best coding practices</w:t>
-      </w:r>
-      <w:r>
-        <w:rPr>
-          <w:rFonts w:ascii="Calibri" w:hAnsi="Calibri" w:cs="Calibri"/>
-        </w:rPr>
-        <w:t xml:space="preserve">, while keeping security in the forefront. </w:t>
+        <w:t>Oversaw a team four engineers, achieving a 30% increase in project completion rates and a 20% improvement in ticket quality through effective leadership and strategic planning</w:t>
+      </w:r>
+      <w:r>
+        <w:rPr>
+          <w:rFonts w:ascii="Calibri" w:hAnsi="Calibri" w:cs="Calibri"/>
+        </w:rPr>
+        <w:t xml:space="preserve">. </w:t>
       </w:r>
     </w:p>
     <w:p>
@@ -1183,14 +1017,20 @@
         <w:ind w:left="540"/>
         <w:contextualSpacing w:val="0"/>
         <w:rPr>
-          <w:rFonts w:cstheme="minorHAnsi"/>
-        </w:rPr>
-      </w:pPr>
-      <w:r>
-        <w:rPr>
-          <w:rFonts w:cstheme="minorHAnsi"/>
-        </w:rPr>
-        <w:t xml:space="preserve">Created a toolkit compose of Bash, PowerShell, and Python scripts that help automate tasks and reduce the amount of manual intervention while also using git version control. </w:t>
+          <w:rFonts w:ascii="Calibri" w:hAnsi="Calibri" w:cs="Calibri"/>
+        </w:rPr>
+      </w:pPr>
+      <w:r>
+        <w:rPr>
+          <w:rFonts w:ascii="Calibri" w:hAnsi="Calibri" w:cs="Calibri"/>
+        </w:rPr>
+        <w:t>Mentored junior engineers in the team, helping them to master technical concepts and gain proficiency with our toolkit, resulting in av</w:t>
+      </w:r>
+      <w:r>
+        <w:rPr>
+          <w:rFonts w:ascii="Calibri" w:hAnsi="Calibri" w:cs="Calibri"/>
+        </w:rPr>
+        <w:t xml:space="preserve">erage 40% improvement in their work quality. </w:t>
       </w:r>
     </w:p>
     <w:p>
@@ -1210,25 +1050,166 @@
         <w:rPr>
           <w:rFonts w:ascii="Calibri" w:hAnsi="Calibri" w:cs="Calibri"/>
         </w:rPr>
-        <w:t xml:space="preserve">Mastered the analysis of large datasets to identify patterns and relationships using </w:t>
-      </w:r>
-      <w:r>
-        <w:rPr>
-          <w:rFonts w:ascii="Calibri" w:hAnsi="Calibri" w:cs="Calibri"/>
-        </w:rPr>
-        <w:t xml:space="preserve">relational </w:t>
-      </w:r>
-      <w:r>
-        <w:rPr>
-          <w:rFonts w:ascii="Calibri" w:hAnsi="Calibri" w:cs="Calibri"/>
-        </w:rPr>
-        <w:t>databases, enhancing data insights by 60%</w:t>
-      </w:r>
-      <w:r>
-        <w:rPr>
-          <w:rFonts w:ascii="Calibri" w:hAnsi="Calibri" w:cs="Calibri"/>
-        </w:rPr>
-        <w:t>.</w:t>
+        <w:t xml:space="preserve">Identified potential issues </w:t>
+      </w:r>
+      <w:r>
+        <w:rPr>
+          <w:rFonts w:ascii="Calibri" w:hAnsi="Calibri" w:cs="Calibri"/>
+        </w:rPr>
+        <w:t>in our microservices</w:t>
+      </w:r>
+      <w:r>
+        <w:rPr>
+          <w:rFonts w:ascii="Calibri" w:hAnsi="Calibri" w:cs="Calibri"/>
+        </w:rPr>
+        <w:t xml:space="preserve"> and raised concerns to optimize project </w:t>
+      </w:r>
+      <w:r>
+        <w:rPr>
+          <w:rFonts w:ascii="Calibri" w:hAnsi="Calibri" w:cs="Calibri"/>
+        </w:rPr>
+        <w:t>timelines</w:t>
+      </w:r>
+      <w:r>
+        <w:rPr>
+          <w:rFonts w:ascii="Calibri" w:hAnsi="Calibri" w:cs="Calibri"/>
+        </w:rPr>
+        <w:t xml:space="preserve"> and resource allocation, ultimately improving both quality of work and spe</w:t>
+      </w:r>
+      <w:r>
+        <w:rPr>
+          <w:rFonts w:ascii="Calibri" w:hAnsi="Calibri" w:cs="Calibri"/>
+        </w:rPr>
+        <w:t>e</w:t>
+      </w:r>
+      <w:r>
+        <w:rPr>
+          <w:rFonts w:ascii="Calibri" w:hAnsi="Calibri" w:cs="Calibri"/>
+        </w:rPr>
+        <w:t xml:space="preserve">d of customer responses by 25%. </w:t>
+      </w:r>
+    </w:p>
+    <w:p>
+      <w:pPr>
+        <w:pStyle w:val="ListParagraph"/>
+        <w:numPr>
+          <w:ilvl w:val="0"/>
+          <w:numId w:val="1"/>
+        </w:numPr>
+        <w:tabs>
+          <w:tab w:val="right" w:pos="10170"/>
+        </w:tabs>
+        <w:ind w:left="540"/>
+        <w:contextualSpacing w:val="0"/>
+        <w:rPr>
+          <w:rFonts w:ascii="Calibri" w:hAnsi="Calibri" w:cs="Calibri"/>
+        </w:rPr>
+      </w:pPr>
+      <w:r>
+        <w:rPr>
+          <w:rFonts w:ascii="Calibri" w:hAnsi="Calibri" w:cs="Calibri"/>
+        </w:rPr>
+        <w:t>Assisted in migrating our on-premise datacenter to AWS cloud services</w:t>
+      </w:r>
+      <w:r>
+        <w:rPr>
+          <w:rFonts w:ascii="Calibri" w:hAnsi="Calibri" w:cs="Calibri"/>
+        </w:rPr>
+        <w:t xml:space="preserve"> and </w:t>
+      </w:r>
+      <w:r>
+        <w:rPr>
+          <w:rFonts w:ascii="Calibri" w:hAnsi="Calibri" w:cs="Calibri"/>
+        </w:rPr>
+        <w:t>collaborating</w:t>
+      </w:r>
+      <w:r>
+        <w:rPr>
+          <w:rFonts w:ascii="Calibri" w:hAnsi="Calibri" w:cs="Calibri"/>
+        </w:rPr>
+        <w:t xml:space="preserve"> with other teams</w:t>
+      </w:r>
+      <w:r>
+        <w:rPr>
+          <w:rFonts w:ascii="Calibri" w:hAnsi="Calibri" w:cs="Calibri"/>
+        </w:rPr>
+        <w:t xml:space="preserve">, driving a 40% reduction in operational costs and </w:t>
+      </w:r>
+      <w:r>
+        <w:rPr>
+          <w:rFonts w:ascii="Calibri" w:hAnsi="Calibri" w:cs="Calibri"/>
+        </w:rPr>
+        <w:t>enhancing</w:t>
+      </w:r>
+      <w:r>
+        <w:rPr>
+          <w:rFonts w:ascii="Calibri" w:hAnsi="Calibri" w:cs="Calibri"/>
+        </w:rPr>
+        <w:t xml:space="preserve"> system scalability and reliability. </w:t>
+      </w:r>
+    </w:p>
+    <w:p>
+      <w:pPr>
+        <w:pStyle w:val="ListParagraph"/>
+        <w:tabs>
+          <w:tab w:val="right" w:pos="10170"/>
+        </w:tabs>
+        <w:ind w:left="540"/>
+        <w:contextualSpacing w:val="0"/>
+        <w:rPr>
+          <w:rFonts w:ascii="Calibri" w:hAnsi="Calibri" w:cs="Calibri"/>
+        </w:rPr>
+      </w:pPr>
+    </w:p>
+    <w:p>
+      <w:pPr>
+        <w:tabs>
+          <w:tab w:val="right" w:pos="10224"/>
+        </w:tabs>
+        <w:spacing w:before="120" w:after="60"/>
+        <w:rPr>
+          <w:rFonts w:ascii="Calibri" w:hAnsi="Calibri" w:cs="Calibri"/>
+          <w:b/>
+        </w:rPr>
+      </w:pPr>
+      <w:r>
+        <w:rPr>
+          <w:rFonts w:ascii="Calibri" w:hAnsi="Calibri" w:cs="Calibri"/>
+          <w:b/>
+        </w:rPr>
+        <w:t>DevOps</w:t>
+      </w:r>
+      <w:r>
+        <w:rPr>
+          <w:rFonts w:ascii="Calibri" w:hAnsi="Calibri" w:cs="Calibri"/>
+          <w:b/>
+        </w:rPr>
+        <w:t xml:space="preserve"> Engineer</w:t>
+      </w:r>
+      <w:r>
+        <w:rPr>
+          <w:rFonts w:ascii="Calibri" w:hAnsi="Calibri" w:cs="Calibri"/>
+          <w:b/>
+        </w:rPr>
+        <w:tab/>
+      </w:r>
+      <w:r>
+        <w:rPr>
+          <w:rFonts w:ascii="Calibri" w:hAnsi="Calibri" w:cs="Calibri"/>
+        </w:rPr>
+        <w:t>May 2016</w:t>
+      </w:r>
+      <w:r>
+        <w:rPr>
+          <w:rFonts w:ascii="Calibri" w:hAnsi="Calibri" w:cs="Calibri"/>
+        </w:rPr>
+        <w:t xml:space="preserve"> – </w:t>
+      </w:r>
+      <w:r>
+        <w:rPr>
+          <w:rFonts w:ascii="Calibri" w:hAnsi="Calibri" w:cs="Calibri"/>
+        </w:rPr>
+        <w:t>Sep 2018</w:t>
       </w:r>
     </w:p>
     <w:p>
@@ -1248,19 +1229,115 @@
         <w:rPr>
           <w:rFonts w:ascii="Calibri" w:hAnsi="Calibri" w:cs="Calibri"/>
         </w:rPr>
-        <w:t xml:space="preserve">Analyzed and reproduced customer issues, systematically collecting and analyzing debug data from our backend services to </w:t>
-      </w:r>
-      <w:r>
-        <w:rPr>
-          <w:rFonts w:ascii="Calibri" w:hAnsi="Calibri" w:cs="Calibri"/>
-        </w:rPr>
-        <w:t>troubleshoot</w:t>
-      </w:r>
-      <w:r>
-        <w:rPr>
-          <w:rFonts w:ascii="Calibri" w:hAnsi="Calibri" w:cs="Calibri"/>
-        </w:rPr>
-        <w:t xml:space="preserve"> and solve critical system performance bottlenecks, thereby enhancing customer experience</w:t>
+        <w:t xml:space="preserve">Provided guidance on effective </w:t>
+      </w:r>
+      <w:r>
+        <w:rPr>
+          <w:rFonts w:ascii="Calibri" w:hAnsi="Calibri" w:cs="Calibri"/>
+        </w:rPr>
+        <w:t>mitigation</w:t>
+      </w:r>
+      <w:r>
+        <w:rPr>
+          <w:rFonts w:ascii="Calibri" w:hAnsi="Calibri" w:cs="Calibri"/>
+        </w:rPr>
+        <w:t xml:space="preserve"> </w:t>
+      </w:r>
+      <w:r>
+        <w:rPr>
+          <w:rFonts w:ascii="Calibri" w:hAnsi="Calibri" w:cs="Calibri"/>
+        </w:rPr>
+        <w:t xml:space="preserve">strategies for </w:t>
+      </w:r>
+      <w:r>
+        <w:rPr>
+          <w:rFonts w:ascii="Calibri" w:hAnsi="Calibri" w:cs="Calibri"/>
+        </w:rPr>
+        <w:t>common CWEs and implementing best coding practices</w:t>
+      </w:r>
+      <w:r>
+        <w:rPr>
+          <w:rFonts w:ascii="Calibri" w:hAnsi="Calibri" w:cs="Calibri"/>
+        </w:rPr>
+        <w:t xml:space="preserve">, while keeping security in the forefront. </w:t>
+      </w:r>
+    </w:p>
+    <w:p>
+      <w:pPr>
+        <w:pStyle w:val="ListParagraph"/>
+        <w:numPr>
+          <w:ilvl w:val="0"/>
+          <w:numId w:val="1"/>
+        </w:numPr>
+        <w:ind w:left="540"/>
+        <w:contextualSpacing w:val="0"/>
+        <w:rPr>
+          <w:rFonts w:cstheme="minorHAnsi"/>
+        </w:rPr>
+      </w:pPr>
+      <w:r>
+        <w:rPr>
+          <w:rFonts w:cstheme="minorHAnsi"/>
+        </w:rPr>
+        <w:t xml:space="preserve">Created a toolkit compose of Bash, PowerShell, and Python scripts that help automate tasks and reduce the amount of manual intervention while also using git version control. </w:t>
+      </w:r>
+    </w:p>
+    <w:p>
+      <w:pPr>
+        <w:pStyle w:val="ListParagraph"/>
+        <w:numPr>
+          <w:ilvl w:val="0"/>
+          <w:numId w:val="1"/>
+        </w:numPr>
+        <w:ind w:left="540"/>
+        <w:contextualSpacing w:val="0"/>
+        <w:rPr>
+          <w:rFonts w:ascii="Calibri" w:hAnsi="Calibri" w:cs="Calibri"/>
+        </w:rPr>
+      </w:pPr>
+      <w:r>
+        <w:rPr>
+          <w:rFonts w:ascii="Calibri" w:hAnsi="Calibri" w:cs="Calibri"/>
+        </w:rPr>
+        <w:t xml:space="preserve">Mastered analysis of large datasets to identify patterns and relationships using </w:t>
+      </w:r>
+      <w:r>
+        <w:rPr>
+          <w:rFonts w:ascii="Calibri" w:hAnsi="Calibri" w:cs="Calibri"/>
+        </w:rPr>
+        <w:t xml:space="preserve">relational </w:t>
+      </w:r>
+      <w:r>
+        <w:rPr>
+          <w:rFonts w:ascii="Calibri" w:hAnsi="Calibri" w:cs="Calibri"/>
+        </w:rPr>
+        <w:t>databases, enhancing data insights by 60%</w:t>
+      </w:r>
+      <w:r>
+        <w:rPr>
+          <w:rFonts w:ascii="Calibri" w:hAnsi="Calibri" w:cs="Calibri"/>
+        </w:rPr>
+        <w:t>.</w:t>
+      </w:r>
+    </w:p>
+    <w:p>
+      <w:pPr>
+        <w:pStyle w:val="ListParagraph"/>
+        <w:numPr>
+          <w:ilvl w:val="0"/>
+          <w:numId w:val="1"/>
+        </w:numPr>
+        <w:ind w:left="540"/>
+        <w:contextualSpacing w:val="0"/>
+        <w:rPr>
+          <w:rFonts w:ascii="Calibri" w:hAnsi="Calibri" w:cs="Calibri"/>
+        </w:rPr>
+      </w:pPr>
+      <w:r>
+        <w:rPr>
+          <w:rFonts w:ascii="Calibri" w:hAnsi="Calibri" w:cs="Calibri"/>
+        </w:rPr>
+        <w:t>Conducted first-pass crash analysis on C++ code, documenting call stacks, memory patterns, and thread behavior to expedite developer troubleshooting efforts</w:t>
       </w:r>
       <w:r>
         <w:rPr>

</xml_diff>

<commit_message>
Deploying to gh-pages from @ guti15/robg-dev@75fb6d7bce5886fac9740d844fcf2cf002aa82a7 🚀
</commit_message>
<xml_diff>
--- a/doc/RobertG_Resume.docx
+++ b/doc/RobertG_Resume.docx
@@ -59,7 +59,19 @@
           <w:sz w:val="22"/>
           <w:szCs w:val="22"/>
         </w:rPr>
-        <w:t xml:space="preserve">LYNN, MA </w:t>
+        <w:t>Boston</w:t>
+      </w:r>
+      <w:r>
+        <w:rPr>
+          <w:rFonts w:ascii="Calibri" w:hAnsi="Calibri" w:cs="Calibri"/>
+          <w:b w:val="0"/>
+          <w:bCs/>
+          <w:smallCaps/>
+          <w:spacing w:val="24"/>
+          <w:sz w:val="22"/>
+          <w:szCs w:val="22"/>
+        </w:rPr>
+        <w:t xml:space="preserve">, MA </w:t>
       </w:r>
     </w:p>
     <w:p>
@@ -101,7 +113,7 @@
             <w:sz w:val="22"/>
             <w:szCs w:val="22"/>
           </w:rPr>
-          <w:t xml:space="preserve">(781) 426-1370 </w:t>
+          <w:t>(781) 426-XXXX</w:t>
         </w:r>
       </w:hyperlink>
       <w:r>
@@ -114,7 +126,7 @@
           <w:sz w:val="22"/>
           <w:szCs w:val="22"/>
         </w:rPr>
-        <w:t xml:space="preserve"> | </w:t>
+        <w:t xml:space="preserve">| </w:t>
       </w:r>
       <w:r>
         <w:rPr>
@@ -262,6 +274,17 @@
           <w:shd w:val="clear" w:color="auto" w:fill="FFFFFF"/>
         </w:rPr>
         <w:t xml:space="preserve">Software Engineer skilled in automation (CI/CD), Security Architecture, and Incident Response. Embraces cross-collaboration to understand company workflows and architecture, enhancing knowledge and functionality. Experienced with SAST and security architecture. </w:t>
+      </w:r>
+      <w:r>
+        <w:rPr>
+          <w:rFonts w:cstheme="minorHAnsi"/>
+          <w:i/>
+          <w:iCs/>
+          <w:sz w:val="21"/>
+          <w:szCs w:val="21"/>
+          <w:shd w:val="clear" w:color="auto" w:fill="FFFFFF"/>
+        </w:rPr>
+        <w:t>Bringing energy, and unyielding grit.</w:t>
       </w:r>
     </w:p>
     <w:p>
@@ -355,7 +378,30 @@
                 <w:rFonts w:cstheme="minorHAnsi"/>
                 <w:color w:val="000000"/>
               </w:rPr>
-              <w:t>Python, Bash, C++, Java, Lisp, html</w:t>
+              <w:t>Python, Bash, C++, Java</w:t>
+            </w:r>
+            <w:r>
+              <w:rPr>
+                <w:rFonts w:cstheme="minorHAnsi"/>
+                <w:color w:val="000000"/>
+              </w:rPr>
+              <w:t xml:space="preserve">, </w:t>
+            </w:r>
+            <w:proofErr w:type="spellStart"/>
+            <w:r>
+              <w:rPr>
+                <w:rFonts w:cstheme="minorHAnsi"/>
+                <w:color w:val="000000"/>
+              </w:rPr>
+              <w:t>Elisp</w:t>
+            </w:r>
+            <w:proofErr w:type="spellEnd"/>
+            <w:r>
+              <w:rPr>
+                <w:rFonts w:cstheme="minorHAnsi"/>
+                <w:color w:val="000000"/>
+              </w:rPr>
+              <w:t>, html</w:t>
             </w:r>
           </w:p>
         </w:tc>
@@ -434,7 +480,31 @@
                 <w:rFonts w:cstheme="minorHAnsi"/>
                 <w:color w:val="000000"/>
               </w:rPr>
-              <w:t>AWS, Docker, GIT, SQL</w:t>
+              <w:t xml:space="preserve">AWS, </w:t>
+            </w:r>
+            <w:proofErr w:type="spellStart"/>
+            <w:r>
+              <w:rPr>
+                <w:rFonts w:ascii="Arial" w:hAnsi="Arial" w:cs="Arial"/>
+                <w:color w:val="262626"/>
+                <w:shd w:val="clear" w:color="auto" w:fill="FFFFFF"/>
+              </w:rPr>
+              <w:t>CMake</w:t>
+            </w:r>
+            <w:proofErr w:type="spellEnd"/>
+            <w:r>
+              <w:rPr>
+                <w:rFonts w:cstheme="minorHAnsi"/>
+                <w:color w:val="000000"/>
+              </w:rPr>
+              <w:t xml:space="preserve">, </w:t>
+            </w:r>
+            <w:r>
+              <w:rPr>
+                <w:rFonts w:cstheme="minorHAnsi"/>
+                <w:color w:val="000000"/>
+              </w:rPr>
+              <w:t>Docker, GIT, SQL</w:t>
             </w:r>
             <w:r>
               <w:rPr>
@@ -456,6 +526,13 @@
                 <w:color w:val="000000"/>
               </w:rPr>
               <w:t>logic</w:t>
+            </w:r>
+            <w:r>
+              <w:rPr>
+                <w:rFonts w:cstheme="minorHAnsi"/>
+                <w:color w:val="000000"/>
+              </w:rPr>
+              <w:t>, IDA</w:t>
             </w:r>
           </w:p>
         </w:tc>
@@ -589,6 +666,13 @@
           <w:rFonts w:ascii="Calibri" w:hAnsi="Calibri" w:cs="Calibri"/>
           <w:b/>
         </w:rPr>
+        <w:t xml:space="preserve"> </w:t>
+      </w:r>
+      <w:r>
+        <w:rPr>
+          <w:rFonts w:ascii="Calibri" w:hAnsi="Calibri" w:cs="Calibri"/>
+          <w:b/>
+        </w:rPr>
         <w:t>Software</w:t>
       </w:r>
       <w:r>
@@ -661,7 +745,19 @@
         <w:rPr>
           <w:rFonts w:ascii="Calibri" w:hAnsi="Calibri" w:cs="Calibri"/>
         </w:rPr>
-        <w:t xml:space="preserve">Led the design, planning, and strategic implementation of new features, dividing tasks into manageable components to enhance project management and streamline development. </w:t>
+        <w:t>Led the design, planning, and strategic implementation of new features, dividing tasks into manageable components to enhance project management and streamline development</w:t>
+      </w:r>
+      <w:r>
+        <w:rPr>
+          <w:rFonts w:ascii="Calibri" w:hAnsi="Calibri" w:cs="Calibri"/>
+        </w:rPr>
+        <w:t xml:space="preserve"> with JIRA</w:t>
+      </w:r>
+      <w:r>
+        <w:rPr>
+          <w:rFonts w:ascii="Calibri" w:hAnsi="Calibri" w:cs="Calibri"/>
+        </w:rPr>
+        <w:t xml:space="preserve">. </w:t>
       </w:r>
     </w:p>
     <w:p>
@@ -695,12 +791,14 @@
         </w:rPr>
         <w:t xml:space="preserve"> </w:t>
       </w:r>
-      <w:r>
-        <w:rPr>
-          <w:rFonts w:ascii="Calibri" w:hAnsi="Calibri" w:cs="Calibri"/>
-        </w:rPr>
-        <w:t>GitLab</w:t>
-      </w:r>
+      <w:proofErr w:type="spellStart"/>
+      <w:r>
+        <w:rPr>
+          <w:rFonts w:ascii="Calibri" w:hAnsi="Calibri" w:cs="Calibri"/>
+        </w:rPr>
+        <w:t>github</w:t>
+      </w:r>
+      <w:proofErr w:type="spellEnd"/>
       <w:r>
         <w:rPr>
           <w:rFonts w:ascii="Calibri" w:hAnsi="Calibri" w:cs="Calibri"/>
@@ -730,38 +828,6 @@
           <w:rFonts w:ascii="Calibri" w:hAnsi="Calibri" w:cs="Calibri"/>
         </w:rPr>
         <w:t xml:space="preserve"> the process, reduced the time over 90%. </w:t>
-      </w:r>
-    </w:p>
-    <w:p>
-      <w:pPr>
-        <w:pStyle w:val="ListParagraph"/>
-        <w:numPr>
-          <w:ilvl w:val="0"/>
-          <w:numId w:val="1"/>
-        </w:numPr>
-        <w:ind w:left="540"/>
-        <w:contextualSpacing w:val="0"/>
-        <w:rPr>
-          <w:rFonts w:ascii="Calibri" w:hAnsi="Calibri" w:cs="Calibri"/>
-        </w:rPr>
-      </w:pPr>
-      <w:r>
-        <w:rPr>
-          <w:rFonts w:ascii="Calibri" w:hAnsi="Calibri" w:cs="Calibri"/>
-        </w:rPr>
-        <w:t xml:space="preserve">Maintained local databases, kept third-party repositories such as Maven, </w:t>
-      </w:r>
-      <w:r>
-        <w:rPr>
-          <w:rFonts w:ascii="Calibri" w:hAnsi="Calibri" w:cs="Calibri"/>
-        </w:rPr>
-        <w:t>NuGet</w:t>
-      </w:r>
-      <w:r>
-        <w:rPr>
-          <w:rFonts w:ascii="Calibri" w:hAnsi="Calibri" w:cs="Calibri"/>
-        </w:rPr>
-        <w:t xml:space="preserve">, and Packagist in sync to further use in internal analysis. </w:t>
       </w:r>
     </w:p>
     <w:p>
@@ -784,220 +850,13 @@
         <w:rPr>
           <w:rFonts w:ascii="Calibri" w:hAnsi="Calibri" w:cs="Calibri"/>
         </w:rPr>
-        <w:t>Automated recompiling code</w:t>
-      </w:r>
-      <w:r>
-        <w:rPr>
-          <w:rFonts w:ascii="Calibri" w:hAnsi="Calibri" w:cs="Calibri"/>
-        </w:rPr>
-        <w:t xml:space="preserve"> utilizing python </w:t>
-      </w:r>
-      <w:r>
-        <w:rPr>
-          <w:rFonts w:ascii="Calibri" w:hAnsi="Calibri" w:cs="Calibri"/>
-        </w:rPr>
-        <w:t>and API to</w:t>
-      </w:r>
-      <w:r>
-        <w:rPr>
-          <w:rFonts w:ascii="Calibri" w:hAnsi="Calibri" w:cs="Calibri"/>
-        </w:rPr>
-        <w:t xml:space="preserve"> </w:t>
-      </w:r>
-      <w:r>
-        <w:rPr>
-          <w:rFonts w:ascii="Calibri" w:hAnsi="Calibri" w:cs="Calibri"/>
-        </w:rPr>
-        <w:t>develop a system to</w:t>
-      </w:r>
-      <w:r>
-        <w:rPr>
-          <w:rFonts w:ascii="Calibri" w:hAnsi="Calibri" w:cs="Calibri"/>
-        </w:rPr>
-        <w:t xml:space="preserve"> use latest version of a compiler with docker containers, increasing our resources used in internal testing. </w:t>
-      </w:r>
-    </w:p>
-    <w:p>
-      <w:pPr>
-        <w:pStyle w:val="ListParagraph"/>
-        <w:tabs>
-          <w:tab w:val="right" w:pos="10170"/>
-        </w:tabs>
-        <w:ind w:left="540"/>
-        <w:contextualSpacing w:val="0"/>
-        <w:rPr>
-          <w:rFonts w:ascii="Calibri" w:hAnsi="Calibri" w:cs="Calibri"/>
-        </w:rPr>
-      </w:pPr>
-      <w:r>
-        <w:rPr>
-          <w:rFonts w:ascii="Calibri" w:hAnsi="Calibri" w:cs="Calibri"/>
-        </w:rPr>
-        <w:tab/>
-      </w:r>
-      <w:r>
-        <w:rPr>
-          <w:rFonts w:ascii="Calibri" w:hAnsi="Calibri" w:cs="Calibri"/>
-        </w:rPr>
-        <w:t xml:space="preserve"> </w:t>
-      </w:r>
-    </w:p>
-    <w:p>
-      <w:pPr>
-        <w:tabs>
-          <w:tab w:val="right" w:pos="10170"/>
-        </w:tabs>
-        <w:rPr>
-          <w:rFonts w:ascii="Calibri" w:hAnsi="Calibri" w:cs="Calibri"/>
-        </w:rPr>
-      </w:pPr>
-      <w:r>
-        <w:rPr>
-          <w:rFonts w:ascii="Calibri" w:hAnsi="Calibri" w:cs="Calibri"/>
-          <w:b/>
-        </w:rPr>
-        <w:t>DevOps</w:t>
-      </w:r>
-      <w:r>
-        <w:rPr>
-          <w:rFonts w:ascii="Calibri" w:hAnsi="Calibri" w:cs="Calibri"/>
-          <w:b/>
-        </w:rPr>
-        <w:t xml:space="preserve"> Team Lea</w:t>
-      </w:r>
-      <w:r>
-        <w:rPr>
-          <w:rFonts w:ascii="Calibri" w:hAnsi="Calibri" w:cs="Calibri"/>
-          <w:b/>
-        </w:rPr>
-        <w:t>der</w:t>
-      </w:r>
-      <w:r>
-        <w:rPr>
-          <w:rFonts w:ascii="Calibri" w:hAnsi="Calibri" w:cs="Calibri"/>
-        </w:rPr>
-        <w:tab/>
-        <w:t>Sep 2018</w:t>
-      </w:r>
-      <w:r>
-        <w:rPr>
-          <w:rFonts w:ascii="Calibri" w:hAnsi="Calibri" w:cs="Calibri"/>
-        </w:rPr>
-        <w:t xml:space="preserve"> – </w:t>
-      </w:r>
-      <w:r>
-        <w:rPr>
-          <w:rFonts w:ascii="Calibri" w:hAnsi="Calibri" w:cs="Calibri"/>
-        </w:rPr>
-        <w:t>Oct 2020</w:t>
-      </w:r>
-    </w:p>
-    <w:p>
-      <w:pPr>
-        <w:pStyle w:val="ListParagraph"/>
-        <w:numPr>
-          <w:ilvl w:val="0"/>
-          <w:numId w:val="1"/>
-        </w:numPr>
-        <w:ind w:left="540"/>
-        <w:contextualSpacing w:val="0"/>
-        <w:rPr>
-          <w:rFonts w:ascii="Calibri" w:hAnsi="Calibri" w:cs="Calibri"/>
-        </w:rPr>
-      </w:pPr>
-      <w:r>
-        <w:rPr>
-          <w:rFonts w:ascii="Calibri" w:hAnsi="Calibri" w:cs="Calibri"/>
-        </w:rPr>
-        <w:t>Oversaw a team four engineers, achieving a 30% increase in project completion rates and a 20% improvement in ticket quality through effective leadership and strategic planning</w:t>
-      </w:r>
-      <w:r>
-        <w:rPr>
-          <w:rFonts w:ascii="Calibri" w:hAnsi="Calibri" w:cs="Calibri"/>
-        </w:rPr>
-        <w:t xml:space="preserve">. </w:t>
-      </w:r>
-    </w:p>
-    <w:p>
-      <w:pPr>
-        <w:pStyle w:val="ListParagraph"/>
-        <w:numPr>
-          <w:ilvl w:val="0"/>
-          <w:numId w:val="1"/>
-        </w:numPr>
-        <w:ind w:left="540"/>
-        <w:contextualSpacing w:val="0"/>
-        <w:rPr>
-          <w:rFonts w:ascii="Calibri" w:hAnsi="Calibri" w:cs="Calibri"/>
-        </w:rPr>
-      </w:pPr>
-      <w:r>
-        <w:rPr>
-          <w:rFonts w:ascii="Calibri" w:hAnsi="Calibri" w:cs="Calibri"/>
-        </w:rPr>
-        <w:t>Mentored junior engineers in the team, helping them to master technical concepts and gain proficiency with our toolkit, resulting in av</w:t>
-      </w:r>
-      <w:r>
-        <w:rPr>
-          <w:rFonts w:ascii="Calibri" w:hAnsi="Calibri" w:cs="Calibri"/>
-        </w:rPr>
-        <w:t xml:space="preserve">erage 40% improvement in their work quality. </w:t>
-      </w:r>
-    </w:p>
-    <w:p>
-      <w:pPr>
-        <w:pStyle w:val="ListParagraph"/>
-        <w:numPr>
-          <w:ilvl w:val="0"/>
-          <w:numId w:val="1"/>
-        </w:numPr>
-        <w:ind w:left="540"/>
-        <w:contextualSpacing w:val="0"/>
-        <w:rPr>
-          <w:rFonts w:ascii="Calibri" w:hAnsi="Calibri" w:cs="Calibri"/>
-        </w:rPr>
-      </w:pPr>
-      <w:r>
-        <w:rPr>
-          <w:rFonts w:ascii="Calibri" w:hAnsi="Calibri" w:cs="Calibri"/>
-        </w:rPr>
-        <w:t xml:space="preserve">Identified potential issues </w:t>
-      </w:r>
-      <w:r>
-        <w:rPr>
-          <w:rFonts w:ascii="Calibri" w:hAnsi="Calibri" w:cs="Calibri"/>
-        </w:rPr>
-        <w:t>in our microservices</w:t>
-      </w:r>
-      <w:r>
-        <w:rPr>
-          <w:rFonts w:ascii="Calibri" w:hAnsi="Calibri" w:cs="Calibri"/>
-        </w:rPr>
-        <w:t xml:space="preserve"> and raised concerns to optimize project </w:t>
-      </w:r>
-      <w:r>
-        <w:rPr>
-          <w:rFonts w:ascii="Calibri" w:hAnsi="Calibri" w:cs="Calibri"/>
-        </w:rPr>
-        <w:t>timelines</w:t>
-      </w:r>
-      <w:r>
-        <w:rPr>
-          <w:rFonts w:ascii="Calibri" w:hAnsi="Calibri" w:cs="Calibri"/>
-        </w:rPr>
-        <w:t xml:space="preserve"> and resource allocation, ultimately improving both quality of work and spe</w:t>
-      </w:r>
-      <w:r>
-        <w:rPr>
-          <w:rFonts w:ascii="Calibri" w:hAnsi="Calibri" w:cs="Calibri"/>
-        </w:rPr>
-        <w:t>e</w:t>
-      </w:r>
-      <w:r>
-        <w:rPr>
-          <w:rFonts w:ascii="Calibri" w:hAnsi="Calibri" w:cs="Calibri"/>
-        </w:rPr>
-        <w:t xml:space="preserve">d of customer responses by 25%. </w:t>
+        <w:t>Led root cause analysis using domain knowledge for production issues across AWS and cloud technologies, enhancing scalability and delivering rapid resolutions</w:t>
+      </w:r>
+      <w:r>
+        <w:rPr>
+          <w:rFonts w:ascii="Calibri" w:hAnsi="Calibri" w:cs="Calibri"/>
+        </w:rPr>
+        <w:t>.</w:t>
       </w:r>
     </w:p>
     <w:p>
@@ -1020,43 +879,31 @@
         <w:rPr>
           <w:rFonts w:ascii="Calibri" w:hAnsi="Calibri" w:cs="Calibri"/>
         </w:rPr>
-        <w:t>Assisted in migrating our on-premise datacenter to AWS cloud services</w:t>
-      </w:r>
-      <w:r>
-        <w:rPr>
-          <w:rFonts w:ascii="Calibri" w:hAnsi="Calibri" w:cs="Calibri"/>
-        </w:rPr>
-        <w:t xml:space="preserve"> and </w:t>
-      </w:r>
-      <w:r>
-        <w:rPr>
-          <w:rFonts w:ascii="Calibri" w:hAnsi="Calibri" w:cs="Calibri"/>
-        </w:rPr>
-        <w:t>collaborating</w:t>
-      </w:r>
-      <w:r>
-        <w:rPr>
-          <w:rFonts w:ascii="Calibri" w:hAnsi="Calibri" w:cs="Calibri"/>
-        </w:rPr>
-        <w:t xml:space="preserve"> with other teams</w:t>
-      </w:r>
-      <w:r>
-        <w:rPr>
-          <w:rFonts w:ascii="Calibri" w:hAnsi="Calibri" w:cs="Calibri"/>
-        </w:rPr>
-        <w:t xml:space="preserve">, driving a 40% reduction in operational costs and </w:t>
-      </w:r>
-      <w:r>
-        <w:rPr>
-          <w:rFonts w:ascii="Calibri" w:hAnsi="Calibri" w:cs="Calibri"/>
-        </w:rPr>
-        <w:t>enhancing</w:t>
-      </w:r>
-      <w:r>
-        <w:rPr>
-          <w:rFonts w:ascii="Calibri" w:hAnsi="Calibri" w:cs="Calibri"/>
-        </w:rPr>
-        <w:t xml:space="preserve"> system scalability and reliability. </w:t>
+        <w:t xml:space="preserve">Automated compiler compatibility testing for security scanning engine using Python, handling code deprecation across </w:t>
+      </w:r>
+      <w:r>
+        <w:rPr>
+          <w:rFonts w:ascii="Calibri" w:hAnsi="Calibri" w:cs="Calibri"/>
+        </w:rPr>
+        <w:t>multiple programming</w:t>
+      </w:r>
+      <w:r>
+        <w:rPr>
+          <w:rFonts w:ascii="Calibri" w:hAnsi="Calibri" w:cs="Calibri"/>
+        </w:rPr>
+        <w:t xml:space="preserve"> languages such as </w:t>
+      </w:r>
+      <w:r>
+        <w:rPr>
+          <w:rFonts w:ascii="Calibri" w:hAnsi="Calibri" w:cs="Calibri"/>
+        </w:rPr>
+        <w:t>Java/C++/.NET</w:t>
+      </w:r>
+      <w:r>
+        <w:rPr>
+          <w:rFonts w:ascii="Calibri" w:hAnsi="Calibri" w:cs="Calibri"/>
+        </w:rPr>
+        <w:t>.</w:t>
       </w:r>
     </w:p>
     <w:p>
@@ -1071,44 +918,55 @@
           <w:rFonts w:ascii="Calibri" w:hAnsi="Calibri" w:cs="Calibri"/>
         </w:rPr>
       </w:pPr>
+      <w:r>
+        <w:rPr>
+          <w:rFonts w:ascii="Calibri" w:hAnsi="Calibri" w:cs="Calibri"/>
+        </w:rPr>
+        <w:tab/>
+      </w:r>
+      <w:r>
+        <w:rPr>
+          <w:rFonts w:ascii="Calibri" w:hAnsi="Calibri" w:cs="Calibri"/>
+        </w:rPr>
+        <w:t xml:space="preserve"> </w:t>
+      </w:r>
     </w:p>
     <w:p>
       <w:pPr>
         <w:tabs>
-          <w:tab w:val="right" w:pos="10224"/>
+          <w:tab w:val="right" w:pos="10170"/>
         </w:tabs>
-        <w:spacing w:before="120" w:after="60"/>
+        <w:rPr>
+          <w:rFonts w:ascii="Calibri" w:hAnsi="Calibri" w:cs="Calibri"/>
+        </w:rPr>
+      </w:pPr>
+      <w:r>
         <w:rPr>
           <w:rFonts w:ascii="Calibri" w:hAnsi="Calibri" w:cs="Calibri"/>
           <w:b/>
         </w:rPr>
-      </w:pPr>
+        <w:t>DevOps</w:t>
+      </w:r>
       <w:r>
         <w:rPr>
           <w:rFonts w:ascii="Calibri" w:hAnsi="Calibri" w:cs="Calibri"/>
           <w:b/>
         </w:rPr>
-        <w:t>DevOps</w:t>
+        <w:t xml:space="preserve"> Team Lea</w:t>
       </w:r>
       <w:r>
         <w:rPr>
           <w:rFonts w:ascii="Calibri" w:hAnsi="Calibri" w:cs="Calibri"/>
           <w:b/>
         </w:rPr>
-        <w:t xml:space="preserve"> Engineer</w:t>
-      </w:r>
-      <w:r>
-        <w:rPr>
-          <w:rFonts w:ascii="Calibri" w:hAnsi="Calibri" w:cs="Calibri"/>
-          <w:b/>
+        <w:t>der</w:t>
+      </w:r>
+      <w:r>
+        <w:rPr>
+          <w:rFonts w:ascii="Calibri" w:hAnsi="Calibri" w:cs="Calibri"/>
         </w:rPr>
         <w:tab/>
-      </w:r>
-      <w:r>
-        <w:rPr>
-          <w:rFonts w:ascii="Calibri" w:hAnsi="Calibri" w:cs="Calibri"/>
-        </w:rPr>
-        <w:t>May 2016</w:t>
+        <w:t>Sep 2018</w:t>
       </w:r>
       <w:r>
         <w:rPr>
@@ -1120,7 +978,7 @@
         <w:rPr>
           <w:rFonts w:ascii="Calibri" w:hAnsi="Calibri" w:cs="Calibri"/>
         </w:rPr>
-        <w:t>Sep 2018</w:t>
+        <w:t>Oct 2020</w:t>
       </w:r>
     </w:p>
     <w:p>
@@ -1140,37 +998,13 @@
         <w:rPr>
           <w:rFonts w:ascii="Calibri" w:hAnsi="Calibri" w:cs="Calibri"/>
         </w:rPr>
-        <w:t xml:space="preserve">Provided guidance on effective </w:t>
-      </w:r>
-      <w:r>
-        <w:rPr>
-          <w:rFonts w:ascii="Calibri" w:hAnsi="Calibri" w:cs="Calibri"/>
-        </w:rPr>
-        <w:t>mitigation</w:t>
-      </w:r>
-      <w:r>
-        <w:rPr>
-          <w:rFonts w:ascii="Calibri" w:hAnsi="Calibri" w:cs="Calibri"/>
-        </w:rPr>
-        <w:t xml:space="preserve"> </w:t>
-      </w:r>
-      <w:r>
-        <w:rPr>
-          <w:rFonts w:ascii="Calibri" w:hAnsi="Calibri" w:cs="Calibri"/>
-        </w:rPr>
-        <w:t xml:space="preserve">strategies for </w:t>
-      </w:r>
-      <w:r>
-        <w:rPr>
-          <w:rFonts w:ascii="Calibri" w:hAnsi="Calibri" w:cs="Calibri"/>
-        </w:rPr>
-        <w:t>common CWEs and implementing best coding practices</w:t>
-      </w:r>
-      <w:r>
-        <w:rPr>
-          <w:rFonts w:ascii="Calibri" w:hAnsi="Calibri" w:cs="Calibri"/>
-        </w:rPr>
-        <w:t xml:space="preserve">, while keeping security in the forefront. </w:t>
+        <w:t>Oversaw a team four engineers, achieving a 30% increase in project completion rates and a 20% improvement in ticket quality through effective leadership and strategic planning</w:t>
+      </w:r>
+      <w:r>
+        <w:rPr>
+          <w:rFonts w:ascii="Calibri" w:hAnsi="Calibri" w:cs="Calibri"/>
+        </w:rPr>
+        <w:t xml:space="preserve">. </w:t>
       </w:r>
     </w:p>
     <w:p>
@@ -1183,14 +1017,20 @@
         <w:ind w:left="540"/>
         <w:contextualSpacing w:val="0"/>
         <w:rPr>
-          <w:rFonts w:cstheme="minorHAnsi"/>
-        </w:rPr>
-      </w:pPr>
-      <w:r>
-        <w:rPr>
-          <w:rFonts w:cstheme="minorHAnsi"/>
-        </w:rPr>
-        <w:t xml:space="preserve">Created a toolkit compose of Bash, PowerShell, and Python scripts that help automate tasks and reduce the amount of manual intervention while also using git version control. </w:t>
+          <w:rFonts w:ascii="Calibri" w:hAnsi="Calibri" w:cs="Calibri"/>
+        </w:rPr>
+      </w:pPr>
+      <w:r>
+        <w:rPr>
+          <w:rFonts w:ascii="Calibri" w:hAnsi="Calibri" w:cs="Calibri"/>
+        </w:rPr>
+        <w:t>Mentored junior engineers in the team, helping them to master technical concepts and gain proficiency with our toolkit, resulting in av</w:t>
+      </w:r>
+      <w:r>
+        <w:rPr>
+          <w:rFonts w:ascii="Calibri" w:hAnsi="Calibri" w:cs="Calibri"/>
+        </w:rPr>
+        <w:t xml:space="preserve">erage 40% improvement in their work quality. </w:t>
       </w:r>
     </w:p>
     <w:p>
@@ -1210,25 +1050,166 @@
         <w:rPr>
           <w:rFonts w:ascii="Calibri" w:hAnsi="Calibri" w:cs="Calibri"/>
         </w:rPr>
-        <w:t xml:space="preserve">Mastered the analysis of large datasets to identify patterns and relationships using </w:t>
-      </w:r>
-      <w:r>
-        <w:rPr>
-          <w:rFonts w:ascii="Calibri" w:hAnsi="Calibri" w:cs="Calibri"/>
-        </w:rPr>
-        <w:t xml:space="preserve">relational </w:t>
-      </w:r>
-      <w:r>
-        <w:rPr>
-          <w:rFonts w:ascii="Calibri" w:hAnsi="Calibri" w:cs="Calibri"/>
-        </w:rPr>
-        <w:t>databases, enhancing data insights by 60%</w:t>
-      </w:r>
-      <w:r>
-        <w:rPr>
-          <w:rFonts w:ascii="Calibri" w:hAnsi="Calibri" w:cs="Calibri"/>
-        </w:rPr>
-        <w:t>.</w:t>
+        <w:t xml:space="preserve">Identified potential issues </w:t>
+      </w:r>
+      <w:r>
+        <w:rPr>
+          <w:rFonts w:ascii="Calibri" w:hAnsi="Calibri" w:cs="Calibri"/>
+        </w:rPr>
+        <w:t>in our microservices</w:t>
+      </w:r>
+      <w:r>
+        <w:rPr>
+          <w:rFonts w:ascii="Calibri" w:hAnsi="Calibri" w:cs="Calibri"/>
+        </w:rPr>
+        <w:t xml:space="preserve"> and raised concerns to optimize project </w:t>
+      </w:r>
+      <w:r>
+        <w:rPr>
+          <w:rFonts w:ascii="Calibri" w:hAnsi="Calibri" w:cs="Calibri"/>
+        </w:rPr>
+        <w:t>timelines</w:t>
+      </w:r>
+      <w:r>
+        <w:rPr>
+          <w:rFonts w:ascii="Calibri" w:hAnsi="Calibri" w:cs="Calibri"/>
+        </w:rPr>
+        <w:t xml:space="preserve"> and resource allocation, ultimately improving both quality of work and spe</w:t>
+      </w:r>
+      <w:r>
+        <w:rPr>
+          <w:rFonts w:ascii="Calibri" w:hAnsi="Calibri" w:cs="Calibri"/>
+        </w:rPr>
+        <w:t>e</w:t>
+      </w:r>
+      <w:r>
+        <w:rPr>
+          <w:rFonts w:ascii="Calibri" w:hAnsi="Calibri" w:cs="Calibri"/>
+        </w:rPr>
+        <w:t xml:space="preserve">d of customer responses by 25%. </w:t>
+      </w:r>
+    </w:p>
+    <w:p>
+      <w:pPr>
+        <w:pStyle w:val="ListParagraph"/>
+        <w:numPr>
+          <w:ilvl w:val="0"/>
+          <w:numId w:val="1"/>
+        </w:numPr>
+        <w:tabs>
+          <w:tab w:val="right" w:pos="10170"/>
+        </w:tabs>
+        <w:ind w:left="540"/>
+        <w:contextualSpacing w:val="0"/>
+        <w:rPr>
+          <w:rFonts w:ascii="Calibri" w:hAnsi="Calibri" w:cs="Calibri"/>
+        </w:rPr>
+      </w:pPr>
+      <w:r>
+        <w:rPr>
+          <w:rFonts w:ascii="Calibri" w:hAnsi="Calibri" w:cs="Calibri"/>
+        </w:rPr>
+        <w:t>Assisted in migrating our on-premise datacenter to AWS cloud services</w:t>
+      </w:r>
+      <w:r>
+        <w:rPr>
+          <w:rFonts w:ascii="Calibri" w:hAnsi="Calibri" w:cs="Calibri"/>
+        </w:rPr>
+        <w:t xml:space="preserve"> and </w:t>
+      </w:r>
+      <w:r>
+        <w:rPr>
+          <w:rFonts w:ascii="Calibri" w:hAnsi="Calibri" w:cs="Calibri"/>
+        </w:rPr>
+        <w:t>collaborating</w:t>
+      </w:r>
+      <w:r>
+        <w:rPr>
+          <w:rFonts w:ascii="Calibri" w:hAnsi="Calibri" w:cs="Calibri"/>
+        </w:rPr>
+        <w:t xml:space="preserve"> with other teams</w:t>
+      </w:r>
+      <w:r>
+        <w:rPr>
+          <w:rFonts w:ascii="Calibri" w:hAnsi="Calibri" w:cs="Calibri"/>
+        </w:rPr>
+        <w:t xml:space="preserve">, driving a 40% reduction in operational costs and </w:t>
+      </w:r>
+      <w:r>
+        <w:rPr>
+          <w:rFonts w:ascii="Calibri" w:hAnsi="Calibri" w:cs="Calibri"/>
+        </w:rPr>
+        <w:t>enhancing</w:t>
+      </w:r>
+      <w:r>
+        <w:rPr>
+          <w:rFonts w:ascii="Calibri" w:hAnsi="Calibri" w:cs="Calibri"/>
+        </w:rPr>
+        <w:t xml:space="preserve"> system scalability and reliability. </w:t>
+      </w:r>
+    </w:p>
+    <w:p>
+      <w:pPr>
+        <w:pStyle w:val="ListParagraph"/>
+        <w:tabs>
+          <w:tab w:val="right" w:pos="10170"/>
+        </w:tabs>
+        <w:ind w:left="540"/>
+        <w:contextualSpacing w:val="0"/>
+        <w:rPr>
+          <w:rFonts w:ascii="Calibri" w:hAnsi="Calibri" w:cs="Calibri"/>
+        </w:rPr>
+      </w:pPr>
+    </w:p>
+    <w:p>
+      <w:pPr>
+        <w:tabs>
+          <w:tab w:val="right" w:pos="10224"/>
+        </w:tabs>
+        <w:spacing w:before="120" w:after="60"/>
+        <w:rPr>
+          <w:rFonts w:ascii="Calibri" w:hAnsi="Calibri" w:cs="Calibri"/>
+          <w:b/>
+        </w:rPr>
+      </w:pPr>
+      <w:r>
+        <w:rPr>
+          <w:rFonts w:ascii="Calibri" w:hAnsi="Calibri" w:cs="Calibri"/>
+          <w:b/>
+        </w:rPr>
+        <w:t>DevOps</w:t>
+      </w:r>
+      <w:r>
+        <w:rPr>
+          <w:rFonts w:ascii="Calibri" w:hAnsi="Calibri" w:cs="Calibri"/>
+          <w:b/>
+        </w:rPr>
+        <w:t xml:space="preserve"> Engineer</w:t>
+      </w:r>
+      <w:r>
+        <w:rPr>
+          <w:rFonts w:ascii="Calibri" w:hAnsi="Calibri" w:cs="Calibri"/>
+          <w:b/>
+        </w:rPr>
+        <w:tab/>
+      </w:r>
+      <w:r>
+        <w:rPr>
+          <w:rFonts w:ascii="Calibri" w:hAnsi="Calibri" w:cs="Calibri"/>
+        </w:rPr>
+        <w:t>May 2016</w:t>
+      </w:r>
+      <w:r>
+        <w:rPr>
+          <w:rFonts w:ascii="Calibri" w:hAnsi="Calibri" w:cs="Calibri"/>
+        </w:rPr>
+        <w:t xml:space="preserve"> – </w:t>
+      </w:r>
+      <w:r>
+        <w:rPr>
+          <w:rFonts w:ascii="Calibri" w:hAnsi="Calibri" w:cs="Calibri"/>
+        </w:rPr>
+        <w:t>Sep 2018</w:t>
       </w:r>
     </w:p>
     <w:p>
@@ -1248,19 +1229,115 @@
         <w:rPr>
           <w:rFonts w:ascii="Calibri" w:hAnsi="Calibri" w:cs="Calibri"/>
         </w:rPr>
-        <w:t xml:space="preserve">Analyzed and reproduced customer issues, systematically collecting and analyzing debug data from our backend services to </w:t>
-      </w:r>
-      <w:r>
-        <w:rPr>
-          <w:rFonts w:ascii="Calibri" w:hAnsi="Calibri" w:cs="Calibri"/>
-        </w:rPr>
-        <w:t>troubleshoot</w:t>
-      </w:r>
-      <w:r>
-        <w:rPr>
-          <w:rFonts w:ascii="Calibri" w:hAnsi="Calibri" w:cs="Calibri"/>
-        </w:rPr>
-        <w:t xml:space="preserve"> and solve critical system performance bottlenecks, thereby enhancing customer experience</w:t>
+        <w:t xml:space="preserve">Provided guidance on effective </w:t>
+      </w:r>
+      <w:r>
+        <w:rPr>
+          <w:rFonts w:ascii="Calibri" w:hAnsi="Calibri" w:cs="Calibri"/>
+        </w:rPr>
+        <w:t>mitigation</w:t>
+      </w:r>
+      <w:r>
+        <w:rPr>
+          <w:rFonts w:ascii="Calibri" w:hAnsi="Calibri" w:cs="Calibri"/>
+        </w:rPr>
+        <w:t xml:space="preserve"> </w:t>
+      </w:r>
+      <w:r>
+        <w:rPr>
+          <w:rFonts w:ascii="Calibri" w:hAnsi="Calibri" w:cs="Calibri"/>
+        </w:rPr>
+        <w:t xml:space="preserve">strategies for </w:t>
+      </w:r>
+      <w:r>
+        <w:rPr>
+          <w:rFonts w:ascii="Calibri" w:hAnsi="Calibri" w:cs="Calibri"/>
+        </w:rPr>
+        <w:t>common CWEs and implementing best coding practices</w:t>
+      </w:r>
+      <w:r>
+        <w:rPr>
+          <w:rFonts w:ascii="Calibri" w:hAnsi="Calibri" w:cs="Calibri"/>
+        </w:rPr>
+        <w:t xml:space="preserve">, while keeping security in the forefront. </w:t>
+      </w:r>
+    </w:p>
+    <w:p>
+      <w:pPr>
+        <w:pStyle w:val="ListParagraph"/>
+        <w:numPr>
+          <w:ilvl w:val="0"/>
+          <w:numId w:val="1"/>
+        </w:numPr>
+        <w:ind w:left="540"/>
+        <w:contextualSpacing w:val="0"/>
+        <w:rPr>
+          <w:rFonts w:cstheme="minorHAnsi"/>
+        </w:rPr>
+      </w:pPr>
+      <w:r>
+        <w:rPr>
+          <w:rFonts w:cstheme="minorHAnsi"/>
+        </w:rPr>
+        <w:t xml:space="preserve">Created a toolkit compose of Bash, PowerShell, and Python scripts that help automate tasks and reduce the amount of manual intervention while also using git version control. </w:t>
+      </w:r>
+    </w:p>
+    <w:p>
+      <w:pPr>
+        <w:pStyle w:val="ListParagraph"/>
+        <w:numPr>
+          <w:ilvl w:val="0"/>
+          <w:numId w:val="1"/>
+        </w:numPr>
+        <w:ind w:left="540"/>
+        <w:contextualSpacing w:val="0"/>
+        <w:rPr>
+          <w:rFonts w:ascii="Calibri" w:hAnsi="Calibri" w:cs="Calibri"/>
+        </w:rPr>
+      </w:pPr>
+      <w:r>
+        <w:rPr>
+          <w:rFonts w:ascii="Calibri" w:hAnsi="Calibri" w:cs="Calibri"/>
+        </w:rPr>
+        <w:t xml:space="preserve">Mastered analysis of large datasets to identify patterns and relationships using </w:t>
+      </w:r>
+      <w:r>
+        <w:rPr>
+          <w:rFonts w:ascii="Calibri" w:hAnsi="Calibri" w:cs="Calibri"/>
+        </w:rPr>
+        <w:t xml:space="preserve">relational </w:t>
+      </w:r>
+      <w:r>
+        <w:rPr>
+          <w:rFonts w:ascii="Calibri" w:hAnsi="Calibri" w:cs="Calibri"/>
+        </w:rPr>
+        <w:t>databases, enhancing data insights by 60%</w:t>
+      </w:r>
+      <w:r>
+        <w:rPr>
+          <w:rFonts w:ascii="Calibri" w:hAnsi="Calibri" w:cs="Calibri"/>
+        </w:rPr>
+        <w:t>.</w:t>
+      </w:r>
+    </w:p>
+    <w:p>
+      <w:pPr>
+        <w:pStyle w:val="ListParagraph"/>
+        <w:numPr>
+          <w:ilvl w:val="0"/>
+          <w:numId w:val="1"/>
+        </w:numPr>
+        <w:ind w:left="540"/>
+        <w:contextualSpacing w:val="0"/>
+        <w:rPr>
+          <w:rFonts w:ascii="Calibri" w:hAnsi="Calibri" w:cs="Calibri"/>
+        </w:rPr>
+      </w:pPr>
+      <w:r>
+        <w:rPr>
+          <w:rFonts w:ascii="Calibri" w:hAnsi="Calibri" w:cs="Calibri"/>
+        </w:rPr>
+        <w:t>Conducted first-pass crash analysis on C++ code, documenting call stacks, memory patterns, and thread behavior to expedite developer troubleshooting efforts</w:t>
       </w:r>
       <w:r>
         <w:rPr>

</xml_diff>